<commit_message>
Handbook: add the 2021 burner-sensor incident to the temperature alarm section
Section 7.2 now explains why the high-temperature alarm exists, using the real
2021 event: the gas burner own sensor failed, its independent controller kept
heating, and because our sensors sit outside that control loop the operators
saw it in time and shut the burner down manually — saving tons of plums.

Ends with the operational point: a yellow tunnel number or a red temperature
is checked immediately, not at the end of the shift.
</commit_message>
<xml_diff>
--- a/Documents/Ръководство за оператора-v1.0.docx
+++ b/Documents/Ръководство за оператора-v1.0.docx
@@ -7391,6 +7391,105 @@
         </w:rPr>
         <w:t>На страницата ДИСПЛЕЙ алармата се вижда по два начина едновременно: номерът на тунела става ЖЪЛТ на сив фон, а самата температура става ЧЕРВЕНА и получер (виж 5.6).</w:t>
       </w:r>
+    </w:p>
+    <w:tbl>
+      <w:tblPr>
+        <w:tblW w:type="auto" w:w="0"/>
+        <w:jc w:val="center"/>
+        <w:tblLook w:firstColumn="1" w:firstRow="1" w:lastColumn="0" w:lastRow="0" w:noHBand="0" w:noVBand="1" w:val="04A0"/>
+      </w:tblPr>
+      <w:tblGrid>
+        <w:gridCol w:w="10224"/>
+      </w:tblGrid>
+      <w:tr>
+        <w:trPr>
+          <w:cantSplit/>
+        </w:trPr>
+        <w:tc>
+          <w:tcPr>
+            <w:tcW w:type="dxa" w:w="10224"/>
+            <w:tcBorders>
+              <w:top w:val="single" w:sz="4" w:color="C62828"/>
+              <w:left w:val="single" w:sz="24" w:color="C62828"/>
+              <w:bottom w:val="single" w:sz="4" w:color="C62828"/>
+              <w:right w:val="single" w:sz="4" w:color="C62828"/>
+            </w:tcBorders>
+            <w:shd w:val="clear" w:color="auto" w:fill="F2F5FA"/>
+            <w:tcMar>
+              <w:top w:w="110" w:type="dxa"/>
+              <w:left w:w="160" w:type="dxa"/>
+              <w:bottom w:w="110" w:type="dxa"/>
+              <w:right w:w="140" w:type="dxa"/>
+            </w:tcMar>
+          </w:tcPr>
+          <w:p>
+            <w:pPr>
+              <w:spacing w:after="80"/>
+            </w:pPr>
+            <w:r>
+              <w:rPr>
+                <w:b/>
+                <w:color w:val="C62828"/>
+                <w:sz w:val="21"/>
+              </w:rPr>
+              <w:t>Защо тази аларма съществува — реален случай от 2021 г.</w:t>
+            </w:r>
+          </w:p>
+          <w:p>
+            <w:pPr>
+              <w:spacing w:after="40" w:line="269" w:lineRule="auto"/>
+            </w:pPr>
+            <w:r>
+              <w:rPr>
+                <w:b w:val="0"/>
+                <w:sz w:val="20"/>
+              </w:rPr>
+              <w:t>Сензорът на самата газова горелка се повреди. Управлението на горелката е независимо от нашата система и то не разбра, че тунелът прегрява — затова продължи да нагрява.</w:t>
+            </w:r>
+          </w:p>
+          <w:p>
+            <w:pPr>
+              <w:spacing w:after="40" w:line="269" w:lineRule="auto"/>
+            </w:pPr>
+            <w:r>
+              <w:rPr>
+                <w:b w:val="0"/>
+                <w:sz w:val="20"/>
+              </w:rPr>
+              <w:t>Нашите сензори са отделни от това управление. Затова покачващата се температура остана видима на екраните.</w:t>
+            </w:r>
+          </w:p>
+          <w:p>
+            <w:pPr>
+              <w:spacing w:after="40" w:line="269" w:lineRule="auto"/>
+            </w:pPr>
+            <w:r>
+              <w:rPr>
+                <w:b w:val="0"/>
+                <w:sz w:val="20"/>
+              </w:rPr>
+              <w:t>Операторите я видяха навреме и спряха горелката ръчно. Така бяха спасени тонове сливи, които иначе щяха да бъдат унищожени.</w:t>
+            </w:r>
+          </w:p>
+          <w:p>
+            <w:pPr>
+              <w:spacing w:after="40" w:line="269" w:lineRule="auto"/>
+            </w:pPr>
+            <w:r>
+              <w:rPr>
+                <w:b/>
+                <w:sz w:val="20"/>
+              </w:rPr>
+              <w:t>Затова: ако номерът на тунел стане ЖЪЛТ или температурата ЧЕРВЕНА — това се проверява веднага, а не в края на смяната.</w:t>
+            </w:r>
+          </w:p>
+        </w:tc>
+      </w:tr>
+    </w:tbl>
+    <w:p>
+      <w:pPr>
+        <w:spacing w:after="40"/>
+      </w:pPr>
     </w:p>
     <w:p>
       <w:pPr>

</xml_diff>